<commit_message>
Update GP report template: remove duplicate OA loop rows
Template had 6 identical {{#oa_rows}}...{{/oa_rows}} rows; reduced to 1
so each data item produces exactly one output row.

Co-Authored-By: Claude Sonnet 4.6 <noreply@anthropic.com>
</commit_message>
<xml_diff>
--- a/backend/assets/GP_Report_Template.docx
+++ b/backend/assets/GP_Report_Template.docx
@@ -60,7 +60,6 @@
           <w:szCs w:val="22"/>
         </w:rPr>
       </w:pPr>
-      <w:proofErr w:type="gramStart"/>
       <w:r>
         <w:rPr>
           <w:b/>
@@ -69,62 +68,7 @@
           <w:sz w:val="22"/>
           <w:szCs w:val="22"/>
         </w:rPr>
-        <w:t xml:space="preserve">{{ </w:t>
-      </w:r>
-      <w:proofErr w:type="spellStart"/>
-      <w:r>
-        <w:rPr>
-          <w:b/>
-          <w:bCs/>
-          <w:color w:val="132232"/>
-          <w:sz w:val="22"/>
-          <w:szCs w:val="22"/>
-        </w:rPr>
-        <w:t>gp</w:t>
-      </w:r>
-      <w:proofErr w:type="gramEnd"/>
-      <w:r>
-        <w:rPr>
-          <w:b/>
-          <w:bCs/>
-          <w:color w:val="132232"/>
-          <w:sz w:val="22"/>
-          <w:szCs w:val="22"/>
-        </w:rPr>
-        <w:t>_</w:t>
-      </w:r>
-      <w:proofErr w:type="gramStart"/>
-      <w:r>
-        <w:rPr>
-          <w:b/>
-          <w:bCs/>
-          <w:color w:val="132232"/>
-          <w:sz w:val="22"/>
-          <w:szCs w:val="22"/>
-        </w:rPr>
-        <w:t>name</w:t>
-      </w:r>
-      <w:proofErr w:type="spellEnd"/>
-      <w:r>
-        <w:rPr>
-          <w:b/>
-          <w:bCs/>
-          <w:color w:val="132232"/>
-          <w:sz w:val="22"/>
-          <w:szCs w:val="22"/>
-        </w:rPr>
-        <w:t xml:space="preserve"> }</w:t>
-      </w:r>
-      <w:proofErr w:type="gramEnd"/>
-      <w:r>
-        <w:rPr>
-          <w:b/>
-          <w:bCs/>
-          <w:color w:val="132232"/>
-          <w:sz w:val="22"/>
-          <w:szCs w:val="22"/>
-        </w:rPr>
-        <w:t>}</w:t>
+        <w:t>{{ gp_name }}</w:t>
       </w:r>
     </w:p>
     <w:p>
@@ -135,53 +79,12 @@
           <w:szCs w:val="22"/>
         </w:rPr>
       </w:pPr>
-      <w:proofErr w:type="gramStart"/>
-      <w:r>
-        <w:rPr>
-          <w:sz w:val="22"/>
-          <w:szCs w:val="22"/>
-        </w:rPr>
-        <w:t xml:space="preserve">{{ </w:t>
-      </w:r>
-      <w:proofErr w:type="spellStart"/>
-      <w:r>
-        <w:rPr>
-          <w:sz w:val="22"/>
-          <w:szCs w:val="22"/>
-        </w:rPr>
-        <w:t>practice</w:t>
-      </w:r>
-      <w:proofErr w:type="gramEnd"/>
-      <w:r>
-        <w:rPr>
-          <w:sz w:val="22"/>
-          <w:szCs w:val="22"/>
-        </w:rPr>
-        <w:t>_</w:t>
-      </w:r>
-      <w:proofErr w:type="gramStart"/>
-      <w:r>
-        <w:rPr>
-          <w:sz w:val="22"/>
-          <w:szCs w:val="22"/>
-        </w:rPr>
-        <w:t>name</w:t>
-      </w:r>
-      <w:proofErr w:type="spellEnd"/>
-      <w:r>
-        <w:rPr>
-          <w:sz w:val="22"/>
-          <w:szCs w:val="22"/>
-        </w:rPr>
-        <w:t xml:space="preserve"> }</w:t>
-      </w:r>
-      <w:proofErr w:type="gramEnd"/>
-      <w:r>
-        <w:rPr>
-          <w:sz w:val="22"/>
-          <w:szCs w:val="22"/>
-        </w:rPr>
-        <w:t>}</w:t>
+      <w:r>
+        <w:rPr>
+          <w:sz w:val="22"/>
+          <w:szCs w:val="22"/>
+        </w:rPr>
+        <w:t>{{ practice_name }}</w:t>
       </w:r>
     </w:p>
     <w:p>
@@ -193,59 +96,13 @@
           <w:szCs w:val="22"/>
         </w:rPr>
       </w:pPr>
-      <w:proofErr w:type="gramStart"/>
-      <w:r>
-        <w:rPr>
-          <w:color w:val="132232"/>
-          <w:sz w:val="22"/>
-          <w:szCs w:val="22"/>
-        </w:rPr>
-        <w:t xml:space="preserve">{{ </w:t>
-      </w:r>
-      <w:proofErr w:type="spellStart"/>
-      <w:r>
-        <w:rPr>
-          <w:color w:val="132232"/>
-          <w:sz w:val="22"/>
-          <w:szCs w:val="22"/>
-        </w:rPr>
-        <w:t>practice</w:t>
-      </w:r>
-      <w:proofErr w:type="gramEnd"/>
-      <w:r>
-        <w:rPr>
-          <w:color w:val="132232"/>
-          <w:sz w:val="22"/>
-          <w:szCs w:val="22"/>
-        </w:rPr>
-        <w:t>_</w:t>
-      </w:r>
-      <w:proofErr w:type="gramStart"/>
-      <w:r>
-        <w:rPr>
-          <w:color w:val="132232"/>
-          <w:sz w:val="22"/>
-          <w:szCs w:val="22"/>
-        </w:rPr>
-        <w:t>address</w:t>
-      </w:r>
-      <w:proofErr w:type="spellEnd"/>
-      <w:r>
-        <w:rPr>
-          <w:color w:val="132232"/>
-          <w:sz w:val="22"/>
-          <w:szCs w:val="22"/>
-        </w:rPr>
-        <w:t xml:space="preserve"> }</w:t>
-      </w:r>
-      <w:proofErr w:type="gramEnd"/>
-      <w:r>
-        <w:rPr>
-          <w:color w:val="132232"/>
-          <w:sz w:val="22"/>
-          <w:szCs w:val="22"/>
-        </w:rPr>
-        <w:t>}</w:t>
+      <w:r>
+        <w:rPr>
+          <w:color w:val="132232"/>
+          <w:sz w:val="22"/>
+          <w:szCs w:val="22"/>
+        </w:rPr>
+        <w:t>{{ practice_address }}</w:t>
       </w:r>
     </w:p>
     <w:p>
@@ -256,59 +113,13 @@
           <w:szCs w:val="22"/>
         </w:rPr>
       </w:pPr>
-      <w:proofErr w:type="gramStart"/>
-      <w:r>
-        <w:rPr>
-          <w:color w:val="132232"/>
-          <w:sz w:val="22"/>
-          <w:szCs w:val="22"/>
-        </w:rPr>
-        <w:t xml:space="preserve">{{ </w:t>
-      </w:r>
-      <w:proofErr w:type="spellStart"/>
-      <w:r>
-        <w:rPr>
-          <w:color w:val="132232"/>
-          <w:sz w:val="22"/>
-          <w:szCs w:val="22"/>
-        </w:rPr>
-        <w:t>practice</w:t>
-      </w:r>
-      <w:proofErr w:type="gramEnd"/>
-      <w:r>
-        <w:rPr>
-          <w:color w:val="132232"/>
-          <w:sz w:val="22"/>
-          <w:szCs w:val="22"/>
-        </w:rPr>
-        <w:t>_</w:t>
-      </w:r>
-      <w:proofErr w:type="gramStart"/>
-      <w:r>
-        <w:rPr>
-          <w:color w:val="132232"/>
-          <w:sz w:val="22"/>
-          <w:szCs w:val="22"/>
-        </w:rPr>
-        <w:t>email</w:t>
-      </w:r>
-      <w:proofErr w:type="spellEnd"/>
-      <w:r>
-        <w:rPr>
-          <w:color w:val="132232"/>
-          <w:sz w:val="22"/>
-          <w:szCs w:val="22"/>
-        </w:rPr>
-        <w:t xml:space="preserve"> }</w:t>
-      </w:r>
-      <w:proofErr w:type="gramEnd"/>
-      <w:r>
-        <w:rPr>
-          <w:color w:val="132232"/>
-          <w:sz w:val="22"/>
-          <w:szCs w:val="22"/>
-        </w:rPr>
-        <w:t>}</w:t>
+      <w:r>
+        <w:rPr>
+          <w:color w:val="132232"/>
+          <w:sz w:val="22"/>
+          <w:szCs w:val="22"/>
+        </w:rPr>
+        <w:t>{{ practice_email }}</w:t>
       </w:r>
       <w:r>
         <w:rPr>
@@ -352,53 +163,12 @@
           <w:szCs w:val="22"/>
         </w:rPr>
       </w:pPr>
-      <w:proofErr w:type="gramStart"/>
-      <w:r>
-        <w:rPr>
-          <w:sz w:val="22"/>
-          <w:szCs w:val="22"/>
-        </w:rPr>
-        <w:t xml:space="preserve">{{ </w:t>
-      </w:r>
-      <w:proofErr w:type="spellStart"/>
-      <w:r>
-        <w:rPr>
-          <w:sz w:val="22"/>
-          <w:szCs w:val="22"/>
-        </w:rPr>
-        <w:t>report</w:t>
-      </w:r>
-      <w:proofErr w:type="gramEnd"/>
-      <w:r>
-        <w:rPr>
-          <w:sz w:val="22"/>
-          <w:szCs w:val="22"/>
-        </w:rPr>
-        <w:t>_</w:t>
-      </w:r>
-      <w:proofErr w:type="gramStart"/>
-      <w:r>
-        <w:rPr>
-          <w:sz w:val="22"/>
-          <w:szCs w:val="22"/>
-        </w:rPr>
-        <w:t>date</w:t>
-      </w:r>
-      <w:proofErr w:type="spellEnd"/>
-      <w:r>
-        <w:rPr>
-          <w:sz w:val="22"/>
-          <w:szCs w:val="22"/>
-        </w:rPr>
-        <w:t xml:space="preserve"> }</w:t>
-      </w:r>
-      <w:proofErr w:type="gramEnd"/>
-      <w:r>
-        <w:rPr>
-          <w:sz w:val="22"/>
-          <w:szCs w:val="22"/>
-        </w:rPr>
-        <w:t>}</w:t>
+      <w:r>
+        <w:rPr>
+          <w:sz w:val="22"/>
+          <w:szCs w:val="22"/>
+        </w:rPr>
+        <w:t>{{ report_date }}</w:t>
       </w:r>
     </w:p>
     <w:p>
@@ -427,59 +197,13 @@
         </w:rPr>
         <w:t xml:space="preserve">Dear </w:t>
       </w:r>
-      <w:proofErr w:type="gramStart"/>
-      <w:r>
-        <w:rPr>
-          <w:color w:val="132232"/>
-          <w:sz w:val="22"/>
-          <w:szCs w:val="22"/>
-        </w:rPr>
-        <w:t xml:space="preserve">{{ </w:t>
-      </w:r>
-      <w:proofErr w:type="spellStart"/>
-      <w:r>
-        <w:rPr>
-          <w:color w:val="132232"/>
-          <w:sz w:val="22"/>
-          <w:szCs w:val="22"/>
-        </w:rPr>
-        <w:t>gp</w:t>
-      </w:r>
-      <w:proofErr w:type="gramEnd"/>
-      <w:r>
-        <w:rPr>
-          <w:color w:val="132232"/>
-          <w:sz w:val="22"/>
-          <w:szCs w:val="22"/>
-        </w:rPr>
-        <w:t>_</w:t>
-      </w:r>
-      <w:proofErr w:type="gramStart"/>
-      <w:r>
-        <w:rPr>
-          <w:color w:val="132232"/>
-          <w:sz w:val="22"/>
-          <w:szCs w:val="22"/>
-        </w:rPr>
-        <w:t>name</w:t>
-      </w:r>
-      <w:proofErr w:type="spellEnd"/>
-      <w:r>
-        <w:rPr>
-          <w:color w:val="132232"/>
-          <w:sz w:val="22"/>
-          <w:szCs w:val="22"/>
-        </w:rPr>
-        <w:t xml:space="preserve"> }</w:t>
-      </w:r>
-      <w:proofErr w:type="gramEnd"/>
-      <w:r>
-        <w:rPr>
-          <w:color w:val="132232"/>
-          <w:sz w:val="22"/>
-          <w:szCs w:val="22"/>
-        </w:rPr>
-        <w:t>}</w:t>
+      <w:r>
+        <w:rPr>
+          <w:color w:val="132232"/>
+          <w:sz w:val="22"/>
+          <w:szCs w:val="22"/>
+        </w:rPr>
+        <w:t>{{ gp_name }}</w:t>
       </w:r>
     </w:p>
     <w:p>
@@ -508,59 +232,13 @@
         </w:rPr>
         <w:t xml:space="preserve">Thank you sincerely for referring </w:t>
       </w:r>
-      <w:proofErr w:type="gramStart"/>
-      <w:r>
-        <w:rPr>
-          <w:color w:val="132232"/>
-          <w:sz w:val="22"/>
-          <w:szCs w:val="22"/>
-        </w:rPr>
-        <w:t xml:space="preserve">{{ </w:t>
-      </w:r>
-      <w:proofErr w:type="spellStart"/>
-      <w:r>
-        <w:rPr>
-          <w:color w:val="132232"/>
-          <w:sz w:val="22"/>
-          <w:szCs w:val="22"/>
-        </w:rPr>
-        <w:t>patient</w:t>
-      </w:r>
-      <w:proofErr w:type="gramEnd"/>
-      <w:r>
-        <w:rPr>
-          <w:color w:val="132232"/>
-          <w:sz w:val="22"/>
-          <w:szCs w:val="22"/>
-        </w:rPr>
-        <w:t>_full_</w:t>
-      </w:r>
-      <w:proofErr w:type="gramStart"/>
-      <w:r>
-        <w:rPr>
-          <w:color w:val="132232"/>
-          <w:sz w:val="22"/>
-          <w:szCs w:val="22"/>
-        </w:rPr>
-        <w:t>name</w:t>
-      </w:r>
-      <w:proofErr w:type="spellEnd"/>
-      <w:r>
-        <w:rPr>
-          <w:color w:val="132232"/>
-          <w:sz w:val="22"/>
-          <w:szCs w:val="22"/>
-        </w:rPr>
-        <w:t xml:space="preserve"> }</w:t>
-      </w:r>
-      <w:proofErr w:type="gramEnd"/>
-      <w:r>
-        <w:rPr>
-          <w:color w:val="132232"/>
-          <w:sz w:val="22"/>
-          <w:szCs w:val="22"/>
-        </w:rPr>
-        <w:t>}</w:t>
+      <w:r>
+        <w:rPr>
+          <w:color w:val="132232"/>
+          <w:sz w:val="22"/>
+          <w:szCs w:val="22"/>
+        </w:rPr>
+        <w:t>{{ patient_full_name }}</w:t>
       </w:r>
       <w:r>
         <w:rPr>
@@ -576,25 +254,7 @@
           <w:sz w:val="22"/>
           <w:szCs w:val="22"/>
         </w:rPr>
-        <w:t xml:space="preserve">to </w:t>
-      </w:r>
-      <w:proofErr w:type="spellStart"/>
-      <w:r>
-        <w:rPr>
-          <w:color w:val="132232"/>
-          <w:sz w:val="22"/>
-          <w:szCs w:val="22"/>
-        </w:rPr>
-        <w:t>Moveify</w:t>
-      </w:r>
-      <w:proofErr w:type="spellEnd"/>
-      <w:r>
-        <w:rPr>
-          <w:color w:val="132232"/>
-          <w:sz w:val="22"/>
-          <w:szCs w:val="22"/>
-        </w:rPr>
-        <w:t xml:space="preserve"> Health Solutions for Exercise Physiology services under the </w:t>
+        <w:t xml:space="preserve">to Moveify Health Solutions for Exercise Physiology services under the </w:t>
       </w:r>
       <w:r>
         <w:rPr>
@@ -612,67 +272,21 @@
         </w:rPr>
         <w:t xml:space="preserve">. Please find below the report and recommendations following </w:t>
       </w:r>
-      <w:proofErr w:type="gramStart"/>
-      <w:r>
-        <w:rPr>
-          <w:color w:val="132232"/>
-          <w:sz w:val="22"/>
-          <w:szCs w:val="22"/>
-        </w:rPr>
-        <w:t xml:space="preserve">{{ </w:t>
-      </w:r>
-      <w:proofErr w:type="spellStart"/>
-      <w:r>
-        <w:rPr>
-          <w:color w:val="132232"/>
-          <w:sz w:val="22"/>
-          <w:szCs w:val="22"/>
-        </w:rPr>
-        <w:t>patient</w:t>
-      </w:r>
-      <w:proofErr w:type="gramEnd"/>
-      <w:r>
-        <w:rPr>
-          <w:color w:val="132232"/>
-          <w:sz w:val="22"/>
-          <w:szCs w:val="22"/>
-        </w:rPr>
-        <w:t>_first_</w:t>
-      </w:r>
-      <w:proofErr w:type="gramStart"/>
-      <w:r>
-        <w:rPr>
-          <w:color w:val="132232"/>
-          <w:sz w:val="22"/>
-          <w:szCs w:val="22"/>
-        </w:rPr>
-        <w:t>name</w:t>
-      </w:r>
-      <w:proofErr w:type="spellEnd"/>
-      <w:r>
-        <w:rPr>
-          <w:color w:val="132232"/>
-          <w:sz w:val="22"/>
-          <w:szCs w:val="22"/>
-        </w:rPr>
-        <w:t xml:space="preserve"> }}</w:t>
-      </w:r>
-      <w:r>
-        <w:rPr>
-          <w:color w:val="132232"/>
-          <w:sz w:val="22"/>
-          <w:szCs w:val="22"/>
-        </w:rPr>
-        <w:t>’</w:t>
-      </w:r>
-      <w:proofErr w:type="gramEnd"/>
-      <w:r>
-        <w:rPr>
-          <w:color w:val="132232"/>
-          <w:sz w:val="22"/>
-          <w:szCs w:val="22"/>
-        </w:rPr>
-        <w:t>s</w:t>
+      <w:r>
+        <w:rPr>
+          <w:color w:val="132232"/>
+          <w:sz w:val="22"/>
+          <w:szCs w:val="22"/>
+        </w:rPr>
+        <w:t>{{ patient_first_name }}</w:t>
+      </w:r>
+      <w:r>
+        <w:rPr>
+          <w:color w:val="132232"/>
+          <w:sz w:val="22"/>
+          <w:szCs w:val="22"/>
+        </w:rPr>
+        <w:t>’s</w:t>
       </w:r>
       <w:r>
         <w:rPr>
@@ -696,15 +310,7 @@
           <w:sz w:val="22"/>
           <w:szCs w:val="22"/>
         </w:rPr>
-        <w:t xml:space="preserve"> {</w:t>
-      </w:r>
-      <w:r>
-        <w:rPr>
-          <w:color w:val="132232"/>
-          <w:sz w:val="22"/>
-          <w:szCs w:val="22"/>
-        </w:rPr>
-        <w:t xml:space="preserve">{ </w:t>
+        <w:t xml:space="preserve"> {{ </w:t>
       </w:r>
     </w:p>
     <w:p>
@@ -722,43 +328,7 @@
           <w:sz w:val="22"/>
           <w:szCs w:val="22"/>
         </w:rPr>
-        <w:t xml:space="preserve">  </w:t>
-      </w:r>
-      <w:proofErr w:type="spellStart"/>
-      <w:r>
-        <w:rPr>
-          <w:color w:val="132232"/>
-          <w:sz w:val="22"/>
-          <w:szCs w:val="22"/>
-        </w:rPr>
-        <w:t>appointment_</w:t>
-      </w:r>
-      <w:proofErr w:type="gramStart"/>
-      <w:r>
-        <w:rPr>
-          <w:color w:val="132232"/>
-          <w:sz w:val="22"/>
-          <w:szCs w:val="22"/>
-        </w:rPr>
-        <w:t>date</w:t>
-      </w:r>
-      <w:proofErr w:type="spellEnd"/>
-      <w:r>
-        <w:rPr>
-          <w:color w:val="132232"/>
-          <w:sz w:val="22"/>
-          <w:szCs w:val="22"/>
-        </w:rPr>
-        <w:t xml:space="preserve"> }</w:t>
-      </w:r>
-      <w:proofErr w:type="gramEnd"/>
-      <w:r>
-        <w:rPr>
-          <w:color w:val="132232"/>
-          <w:sz w:val="22"/>
-          <w:szCs w:val="22"/>
-        </w:rPr>
-        <w:t>}</w:t>
+        <w:t xml:space="preserve">  appointment_date }}</w:t>
       </w:r>
       <w:r>
         <w:rPr>
@@ -1103,37 +673,12 @@
                 <w:szCs w:val="22"/>
               </w:rPr>
             </w:pPr>
-            <w:proofErr w:type="gramStart"/>
             <w:r>
               <w:rPr>
                 <w:sz w:val="22"/>
                 <w:szCs w:val="22"/>
               </w:rPr>
-              <w:t xml:space="preserve">{{ </w:t>
-            </w:r>
-            <w:proofErr w:type="spellStart"/>
-            <w:r>
-              <w:rPr>
-                <w:sz w:val="22"/>
-                <w:szCs w:val="22"/>
-              </w:rPr>
-              <w:t>patient</w:t>
-            </w:r>
-            <w:proofErr w:type="gramEnd"/>
-            <w:r>
-              <w:rPr>
-                <w:sz w:val="22"/>
-                <w:szCs w:val="22"/>
-              </w:rPr>
-              <w:t>_full_name</w:t>
-            </w:r>
-            <w:proofErr w:type="spellEnd"/>
-            <w:r>
-              <w:rPr>
-                <w:sz w:val="22"/>
-                <w:szCs w:val="22"/>
-              </w:rPr>
-              <w:t xml:space="preserve"> }}</w:t>
+              <w:t>{{ patient_full_name }}</w:t>
             </w:r>
           </w:p>
         </w:tc>
@@ -1192,37 +737,12 @@
                 <w:szCs w:val="22"/>
               </w:rPr>
             </w:pPr>
-            <w:proofErr w:type="gramStart"/>
             <w:r>
               <w:rPr>
                 <w:sz w:val="22"/>
                 <w:szCs w:val="22"/>
               </w:rPr>
-              <w:t xml:space="preserve">{{ </w:t>
-            </w:r>
-            <w:proofErr w:type="spellStart"/>
-            <w:r>
-              <w:rPr>
-                <w:sz w:val="22"/>
-                <w:szCs w:val="22"/>
-              </w:rPr>
-              <w:t>gp</w:t>
-            </w:r>
-            <w:proofErr w:type="gramEnd"/>
-            <w:r>
-              <w:rPr>
-                <w:sz w:val="22"/>
-                <w:szCs w:val="22"/>
-              </w:rPr>
-              <w:t>_name</w:t>
-            </w:r>
-            <w:proofErr w:type="spellEnd"/>
-            <w:r>
-              <w:rPr>
-                <w:sz w:val="22"/>
-                <w:szCs w:val="22"/>
-              </w:rPr>
-              <w:t xml:space="preserve"> }}</w:t>
+              <w:t>{{ gp_name }}</w:t>
             </w:r>
           </w:p>
         </w:tc>
@@ -1281,37 +801,12 @@
                 <w:szCs w:val="22"/>
               </w:rPr>
             </w:pPr>
-            <w:proofErr w:type="gramStart"/>
             <w:r>
               <w:rPr>
                 <w:sz w:val="22"/>
                 <w:szCs w:val="22"/>
               </w:rPr>
-              <w:t xml:space="preserve">{{ </w:t>
-            </w:r>
-            <w:proofErr w:type="spellStart"/>
-            <w:r>
-              <w:rPr>
-                <w:sz w:val="22"/>
-                <w:szCs w:val="22"/>
-              </w:rPr>
-              <w:t>patient</w:t>
-            </w:r>
-            <w:proofErr w:type="gramEnd"/>
-            <w:r>
-              <w:rPr>
-                <w:sz w:val="22"/>
-                <w:szCs w:val="22"/>
-              </w:rPr>
-              <w:t>_dob</w:t>
-            </w:r>
-            <w:proofErr w:type="spellEnd"/>
-            <w:r>
-              <w:rPr>
-                <w:sz w:val="22"/>
-                <w:szCs w:val="22"/>
-              </w:rPr>
-              <w:t xml:space="preserve"> }}</w:t>
+              <w:t>{{ patient_dob }}</w:t>
             </w:r>
           </w:p>
         </w:tc>
@@ -1430,37 +925,12 @@
                 <w:szCs w:val="22"/>
               </w:rPr>
             </w:pPr>
-            <w:proofErr w:type="gramStart"/>
             <w:r>
               <w:rPr>
                 <w:sz w:val="22"/>
                 <w:szCs w:val="22"/>
               </w:rPr>
-              <w:t xml:space="preserve">{{ </w:t>
-            </w:r>
-            <w:proofErr w:type="spellStart"/>
-            <w:r>
-              <w:rPr>
-                <w:sz w:val="22"/>
-                <w:szCs w:val="22"/>
-              </w:rPr>
-              <w:t>referral</w:t>
-            </w:r>
-            <w:proofErr w:type="gramEnd"/>
-            <w:r>
-              <w:rPr>
-                <w:sz w:val="22"/>
-                <w:szCs w:val="22"/>
-              </w:rPr>
-              <w:t>_date</w:t>
-            </w:r>
-            <w:proofErr w:type="spellEnd"/>
-            <w:r>
-              <w:rPr>
-                <w:sz w:val="22"/>
-                <w:szCs w:val="22"/>
-              </w:rPr>
-              <w:t xml:space="preserve"> }}</w:t>
+              <w:t>{{ referral_date }}</w:t>
             </w:r>
           </w:p>
         </w:tc>
@@ -1505,53 +975,12 @@
           <w:szCs w:val="22"/>
         </w:rPr>
       </w:pPr>
-      <w:proofErr w:type="gramStart"/>
-      <w:r>
-        <w:rPr>
-          <w:sz w:val="22"/>
-          <w:szCs w:val="22"/>
-        </w:rPr>
-        <w:t xml:space="preserve">{{ </w:t>
-      </w:r>
-      <w:proofErr w:type="spellStart"/>
-      <w:r>
-        <w:rPr>
-          <w:sz w:val="22"/>
-          <w:szCs w:val="22"/>
-        </w:rPr>
-        <w:t>executive</w:t>
-      </w:r>
-      <w:proofErr w:type="gramEnd"/>
-      <w:r>
-        <w:rPr>
-          <w:sz w:val="22"/>
-          <w:szCs w:val="22"/>
-        </w:rPr>
-        <w:t>_</w:t>
-      </w:r>
-      <w:proofErr w:type="gramStart"/>
-      <w:r>
-        <w:rPr>
-          <w:sz w:val="22"/>
-          <w:szCs w:val="22"/>
-        </w:rPr>
-        <w:t>summary</w:t>
-      </w:r>
-      <w:proofErr w:type="spellEnd"/>
-      <w:r>
-        <w:rPr>
-          <w:sz w:val="22"/>
-          <w:szCs w:val="22"/>
-        </w:rPr>
-        <w:t xml:space="preserve"> }</w:t>
-      </w:r>
-      <w:proofErr w:type="gramEnd"/>
-      <w:r>
-        <w:rPr>
-          <w:sz w:val="22"/>
-          <w:szCs w:val="22"/>
-        </w:rPr>
-        <w:t>}</w:t>
+      <w:r>
+        <w:rPr>
+          <w:sz w:val="22"/>
+          <w:szCs w:val="22"/>
+        </w:rPr>
+        <w:t>{{ executive_summary }}</w:t>
       </w:r>
     </w:p>
     <w:p>
@@ -1728,29 +1157,7 @@
                 <w:sz w:val="22"/>
                 <w:szCs w:val="22"/>
               </w:rPr>
-              <w:t>{{#oa_rows</w:t>
-            </w:r>
-            <w:proofErr w:type="gramStart"/>
-            <w:r>
-              <w:rPr>
-                <w:b/>
-                <w:bCs/>
-                <w:color w:val="132232"/>
-                <w:sz w:val="22"/>
-                <w:szCs w:val="22"/>
-              </w:rPr>
-              <w:t>}}{</w:t>
-            </w:r>
-            <w:proofErr w:type="gramEnd"/>
-            <w:r>
-              <w:rPr>
-                <w:b/>
-                <w:bCs/>
-                <w:color w:val="132232"/>
-                <w:sz w:val="22"/>
-                <w:szCs w:val="22"/>
-              </w:rPr>
-              <w:t xml:space="preserve">{test}}  </w:t>
+              <w:t xml:space="preserve">{{#oa_rows}}{{test}}  </w:t>
             </w:r>
           </w:p>
         </w:tc>
@@ -1805,754 +1212,7 @@
                 <w:sz w:val="22"/>
                 <w:szCs w:val="22"/>
               </w:rPr>
-              <w:t>{{interpretation</w:t>
-            </w:r>
-            <w:proofErr w:type="gramStart"/>
-            <w:r>
-              <w:rPr>
-                <w:sz w:val="22"/>
-                <w:szCs w:val="22"/>
-              </w:rPr>
-              <w:t>}}{</w:t>
-            </w:r>
-            <w:proofErr w:type="gramEnd"/>
-            <w:r>
-              <w:rPr>
-                <w:sz w:val="22"/>
-                <w:szCs w:val="22"/>
-              </w:rPr>
-              <w:t>{/</w:t>
-            </w:r>
-            <w:proofErr w:type="spellStart"/>
-            <w:r>
-              <w:rPr>
-                <w:sz w:val="22"/>
-                <w:szCs w:val="22"/>
-              </w:rPr>
-              <w:t>oa_rows</w:t>
-            </w:r>
-            <w:proofErr w:type="spellEnd"/>
-            <w:r>
-              <w:rPr>
-                <w:sz w:val="22"/>
-                <w:szCs w:val="22"/>
-              </w:rPr>
-              <w:t>}}</w:t>
-            </w:r>
-          </w:p>
-        </w:tc>
-      </w:tr>
-      <w:tr>
-        <w:tc>
-          <w:tcPr>
-            <w:tcW w:w="2436" w:type="dxa"/>
-            <w:tcMar>
-              <w:top w:w="80" w:type="dxa"/>
-              <w:left w:w="120" w:type="dxa"/>
-              <w:bottom w:w="80" w:type="dxa"/>
-              <w:right w:w="120" w:type="dxa"/>
-            </w:tcMar>
-            <w:vAlign w:val="center"/>
-          </w:tcPr>
-          <w:p>
-            <w:pPr>
-              <w:rPr>
-                <w:b/>
-                <w:bCs/>
-                <w:sz w:val="22"/>
-                <w:szCs w:val="22"/>
-              </w:rPr>
-            </w:pPr>
-            <w:r>
-              <w:rPr>
-                <w:b/>
-                <w:bCs/>
-                <w:color w:val="132232"/>
-                <w:sz w:val="22"/>
-                <w:szCs w:val="22"/>
-              </w:rPr>
-              <w:t>{{#oa_rows</w:t>
-            </w:r>
-            <w:proofErr w:type="gramStart"/>
-            <w:r>
-              <w:rPr>
-                <w:b/>
-                <w:bCs/>
-                <w:color w:val="132232"/>
-                <w:sz w:val="22"/>
-                <w:szCs w:val="22"/>
-              </w:rPr>
-              <w:t>}}{</w:t>
-            </w:r>
-            <w:proofErr w:type="gramEnd"/>
-            <w:r>
-              <w:rPr>
-                <w:b/>
-                <w:bCs/>
-                <w:color w:val="132232"/>
-                <w:sz w:val="22"/>
-                <w:szCs w:val="22"/>
-              </w:rPr>
-              <w:t xml:space="preserve">{test}}  </w:t>
-            </w:r>
-          </w:p>
-        </w:tc>
-        <w:tc>
-          <w:tcPr>
-            <w:tcW w:w="1816" w:type="dxa"/>
-            <w:tcMar>
-              <w:top w:w="80" w:type="dxa"/>
-              <w:left w:w="120" w:type="dxa"/>
-              <w:bottom w:w="80" w:type="dxa"/>
-              <w:right w:w="120" w:type="dxa"/>
-            </w:tcMar>
-            <w:vAlign w:val="center"/>
-          </w:tcPr>
-          <w:p>
-            <w:pPr>
-              <w:rPr>
-                <w:sz w:val="22"/>
-                <w:szCs w:val="22"/>
-              </w:rPr>
-            </w:pPr>
-            <w:r>
-              <w:rPr>
-                <w:color w:val="132232"/>
-                <w:sz w:val="22"/>
-                <w:szCs w:val="22"/>
-              </w:rPr>
-              <w:t>{{result}}</w:t>
-            </w:r>
-          </w:p>
-        </w:tc>
-        <w:tc>
-          <w:tcPr>
-            <w:tcW w:w="5494" w:type="dxa"/>
-            <w:tcMar>
-              <w:top w:w="80" w:type="dxa"/>
-              <w:left w:w="120" w:type="dxa"/>
-              <w:bottom w:w="80" w:type="dxa"/>
-              <w:right w:w="120" w:type="dxa"/>
-            </w:tcMar>
-            <w:vAlign w:val="center"/>
-          </w:tcPr>
-          <w:p>
-            <w:pPr>
-              <w:rPr>
-                <w:sz w:val="22"/>
-                <w:szCs w:val="22"/>
-              </w:rPr>
-            </w:pPr>
-            <w:r>
-              <w:rPr>
-                <w:sz w:val="22"/>
-                <w:szCs w:val="22"/>
-              </w:rPr>
-              <w:t>{{interpretation</w:t>
-            </w:r>
-            <w:proofErr w:type="gramStart"/>
-            <w:r>
-              <w:rPr>
-                <w:sz w:val="22"/>
-                <w:szCs w:val="22"/>
-              </w:rPr>
-              <w:t>}}{</w:t>
-            </w:r>
-            <w:proofErr w:type="gramEnd"/>
-            <w:r>
-              <w:rPr>
-                <w:sz w:val="22"/>
-                <w:szCs w:val="22"/>
-              </w:rPr>
-              <w:t>{/</w:t>
-            </w:r>
-            <w:proofErr w:type="spellStart"/>
-            <w:r>
-              <w:rPr>
-                <w:sz w:val="22"/>
-                <w:szCs w:val="22"/>
-              </w:rPr>
-              <w:t>oa_rows</w:t>
-            </w:r>
-            <w:proofErr w:type="spellEnd"/>
-            <w:r>
-              <w:rPr>
-                <w:sz w:val="22"/>
-                <w:szCs w:val="22"/>
-              </w:rPr>
-              <w:t>}}</w:t>
-            </w:r>
-          </w:p>
-        </w:tc>
-      </w:tr>
-      <w:tr>
-        <w:tc>
-          <w:tcPr>
-            <w:tcW w:w="2436" w:type="dxa"/>
-            <w:tcMar>
-              <w:top w:w="80" w:type="dxa"/>
-              <w:left w:w="120" w:type="dxa"/>
-              <w:bottom w:w="80" w:type="dxa"/>
-              <w:right w:w="120" w:type="dxa"/>
-            </w:tcMar>
-            <w:vAlign w:val="center"/>
-          </w:tcPr>
-          <w:p>
-            <w:pPr>
-              <w:rPr>
-                <w:b/>
-                <w:bCs/>
-                <w:sz w:val="22"/>
-                <w:szCs w:val="22"/>
-              </w:rPr>
-            </w:pPr>
-            <w:r>
-              <w:rPr>
-                <w:b/>
-                <w:bCs/>
-                <w:color w:val="132232"/>
-                <w:sz w:val="22"/>
-                <w:szCs w:val="22"/>
-              </w:rPr>
-              <w:t>{{#oa_rows</w:t>
-            </w:r>
-            <w:proofErr w:type="gramStart"/>
-            <w:r>
-              <w:rPr>
-                <w:b/>
-                <w:bCs/>
-                <w:color w:val="132232"/>
-                <w:sz w:val="22"/>
-                <w:szCs w:val="22"/>
-              </w:rPr>
-              <w:t>}}{</w:t>
-            </w:r>
-            <w:proofErr w:type="gramEnd"/>
-            <w:r>
-              <w:rPr>
-                <w:b/>
-                <w:bCs/>
-                <w:color w:val="132232"/>
-                <w:sz w:val="22"/>
-                <w:szCs w:val="22"/>
-              </w:rPr>
-              <w:t xml:space="preserve">{test}}  </w:t>
-            </w:r>
-          </w:p>
-        </w:tc>
-        <w:tc>
-          <w:tcPr>
-            <w:tcW w:w="1816" w:type="dxa"/>
-            <w:tcMar>
-              <w:top w:w="80" w:type="dxa"/>
-              <w:left w:w="120" w:type="dxa"/>
-              <w:bottom w:w="80" w:type="dxa"/>
-              <w:right w:w="120" w:type="dxa"/>
-            </w:tcMar>
-            <w:vAlign w:val="center"/>
-          </w:tcPr>
-          <w:p>
-            <w:pPr>
-              <w:rPr>
-                <w:sz w:val="22"/>
-                <w:szCs w:val="22"/>
-              </w:rPr>
-            </w:pPr>
-            <w:r>
-              <w:rPr>
-                <w:color w:val="132232"/>
-                <w:sz w:val="22"/>
-                <w:szCs w:val="22"/>
-              </w:rPr>
-              <w:t>{{result}}</w:t>
-            </w:r>
-          </w:p>
-        </w:tc>
-        <w:tc>
-          <w:tcPr>
-            <w:tcW w:w="5494" w:type="dxa"/>
-            <w:tcMar>
-              <w:top w:w="80" w:type="dxa"/>
-              <w:left w:w="120" w:type="dxa"/>
-              <w:bottom w:w="80" w:type="dxa"/>
-              <w:right w:w="120" w:type="dxa"/>
-            </w:tcMar>
-            <w:vAlign w:val="center"/>
-          </w:tcPr>
-          <w:p>
-            <w:pPr>
-              <w:rPr>
-                <w:sz w:val="22"/>
-                <w:szCs w:val="22"/>
-              </w:rPr>
-            </w:pPr>
-            <w:r>
-              <w:rPr>
-                <w:sz w:val="22"/>
-                <w:szCs w:val="22"/>
-              </w:rPr>
-              <w:t>{{interpretation</w:t>
-            </w:r>
-            <w:proofErr w:type="gramStart"/>
-            <w:r>
-              <w:rPr>
-                <w:sz w:val="22"/>
-                <w:szCs w:val="22"/>
-              </w:rPr>
-              <w:t>}}{</w:t>
-            </w:r>
-            <w:proofErr w:type="gramEnd"/>
-            <w:r>
-              <w:rPr>
-                <w:sz w:val="22"/>
-                <w:szCs w:val="22"/>
-              </w:rPr>
-              <w:t>{/</w:t>
-            </w:r>
-            <w:proofErr w:type="spellStart"/>
-            <w:r>
-              <w:rPr>
-                <w:sz w:val="22"/>
-                <w:szCs w:val="22"/>
-              </w:rPr>
-              <w:t>oa_rows</w:t>
-            </w:r>
-            <w:proofErr w:type="spellEnd"/>
-            <w:r>
-              <w:rPr>
-                <w:sz w:val="22"/>
-                <w:szCs w:val="22"/>
-              </w:rPr>
-              <w:t>}}</w:t>
-            </w:r>
-          </w:p>
-        </w:tc>
-      </w:tr>
-      <w:tr>
-        <w:tc>
-          <w:tcPr>
-            <w:tcW w:w="2436" w:type="dxa"/>
-            <w:tcMar>
-              <w:top w:w="80" w:type="dxa"/>
-              <w:left w:w="120" w:type="dxa"/>
-              <w:bottom w:w="80" w:type="dxa"/>
-              <w:right w:w="120" w:type="dxa"/>
-            </w:tcMar>
-            <w:vAlign w:val="center"/>
-          </w:tcPr>
-          <w:p>
-            <w:pPr>
-              <w:rPr>
-                <w:b/>
-                <w:bCs/>
-                <w:sz w:val="22"/>
-                <w:szCs w:val="22"/>
-              </w:rPr>
-            </w:pPr>
-            <w:r>
-              <w:rPr>
-                <w:b/>
-                <w:bCs/>
-                <w:color w:val="132232"/>
-                <w:sz w:val="22"/>
-                <w:szCs w:val="22"/>
-              </w:rPr>
-              <w:t>{{#oa_rows</w:t>
-            </w:r>
-            <w:proofErr w:type="gramStart"/>
-            <w:r>
-              <w:rPr>
-                <w:b/>
-                <w:bCs/>
-                <w:color w:val="132232"/>
-                <w:sz w:val="22"/>
-                <w:szCs w:val="22"/>
-              </w:rPr>
-              <w:t>}}{</w:t>
-            </w:r>
-            <w:proofErr w:type="gramEnd"/>
-            <w:r>
-              <w:rPr>
-                <w:b/>
-                <w:bCs/>
-                <w:color w:val="132232"/>
-                <w:sz w:val="22"/>
-                <w:szCs w:val="22"/>
-              </w:rPr>
-              <w:t xml:space="preserve">{test}}  </w:t>
-            </w:r>
-          </w:p>
-        </w:tc>
-        <w:tc>
-          <w:tcPr>
-            <w:tcW w:w="1816" w:type="dxa"/>
-            <w:tcMar>
-              <w:top w:w="80" w:type="dxa"/>
-              <w:left w:w="120" w:type="dxa"/>
-              <w:bottom w:w="80" w:type="dxa"/>
-              <w:right w:w="120" w:type="dxa"/>
-            </w:tcMar>
-            <w:vAlign w:val="center"/>
-          </w:tcPr>
-          <w:p>
-            <w:pPr>
-              <w:rPr>
-                <w:sz w:val="22"/>
-                <w:szCs w:val="22"/>
-              </w:rPr>
-            </w:pPr>
-            <w:r>
-              <w:rPr>
-                <w:color w:val="132232"/>
-                <w:sz w:val="22"/>
-                <w:szCs w:val="22"/>
-              </w:rPr>
-              <w:t>{{result}}</w:t>
-            </w:r>
-          </w:p>
-        </w:tc>
-        <w:tc>
-          <w:tcPr>
-            <w:tcW w:w="5494" w:type="dxa"/>
-            <w:tcMar>
-              <w:top w:w="80" w:type="dxa"/>
-              <w:left w:w="120" w:type="dxa"/>
-              <w:bottom w:w="80" w:type="dxa"/>
-              <w:right w:w="120" w:type="dxa"/>
-            </w:tcMar>
-            <w:vAlign w:val="center"/>
-          </w:tcPr>
-          <w:p>
-            <w:pPr>
-              <w:rPr>
-                <w:sz w:val="22"/>
-                <w:szCs w:val="22"/>
-              </w:rPr>
-            </w:pPr>
-            <w:r>
-              <w:rPr>
-                <w:sz w:val="22"/>
-                <w:szCs w:val="22"/>
-              </w:rPr>
-              <w:t>{{interpretation</w:t>
-            </w:r>
-            <w:proofErr w:type="gramStart"/>
-            <w:r>
-              <w:rPr>
-                <w:sz w:val="22"/>
-                <w:szCs w:val="22"/>
-              </w:rPr>
-              <w:t>}}{</w:t>
-            </w:r>
-            <w:proofErr w:type="gramEnd"/>
-            <w:r>
-              <w:rPr>
-                <w:sz w:val="22"/>
-                <w:szCs w:val="22"/>
-              </w:rPr>
-              <w:t>{/</w:t>
-            </w:r>
-            <w:proofErr w:type="spellStart"/>
-            <w:r>
-              <w:rPr>
-                <w:sz w:val="22"/>
-                <w:szCs w:val="22"/>
-              </w:rPr>
-              <w:t>oa_rows</w:t>
-            </w:r>
-            <w:proofErr w:type="spellEnd"/>
-            <w:r>
-              <w:rPr>
-                <w:sz w:val="22"/>
-                <w:szCs w:val="22"/>
-              </w:rPr>
-              <w:t>}}</w:t>
-            </w:r>
-          </w:p>
-        </w:tc>
-      </w:tr>
-      <w:tr>
-        <w:tc>
-          <w:tcPr>
-            <w:tcW w:w="2436" w:type="dxa"/>
-            <w:tcMar>
-              <w:top w:w="80" w:type="dxa"/>
-              <w:left w:w="120" w:type="dxa"/>
-              <w:bottom w:w="80" w:type="dxa"/>
-              <w:right w:w="120" w:type="dxa"/>
-            </w:tcMar>
-            <w:vAlign w:val="center"/>
-          </w:tcPr>
-          <w:p>
-            <w:pPr>
-              <w:rPr>
-                <w:b/>
-                <w:bCs/>
-                <w:sz w:val="22"/>
-                <w:szCs w:val="22"/>
-              </w:rPr>
-            </w:pPr>
-            <w:r>
-              <w:rPr>
-                <w:b/>
-                <w:bCs/>
-                <w:color w:val="132232"/>
-                <w:sz w:val="22"/>
-                <w:szCs w:val="22"/>
-              </w:rPr>
-              <w:t>{{#oa_rows</w:t>
-            </w:r>
-            <w:proofErr w:type="gramStart"/>
-            <w:r>
-              <w:rPr>
-                <w:b/>
-                <w:bCs/>
-                <w:color w:val="132232"/>
-                <w:sz w:val="22"/>
-                <w:szCs w:val="22"/>
-              </w:rPr>
-              <w:t>}}{</w:t>
-            </w:r>
-            <w:proofErr w:type="gramEnd"/>
-            <w:r>
-              <w:rPr>
-                <w:b/>
-                <w:bCs/>
-                <w:color w:val="132232"/>
-                <w:sz w:val="22"/>
-                <w:szCs w:val="22"/>
-              </w:rPr>
-              <w:t xml:space="preserve">{test}}  </w:t>
-            </w:r>
-          </w:p>
-        </w:tc>
-        <w:tc>
-          <w:tcPr>
-            <w:tcW w:w="1816" w:type="dxa"/>
-            <w:tcMar>
-              <w:top w:w="80" w:type="dxa"/>
-              <w:left w:w="120" w:type="dxa"/>
-              <w:bottom w:w="80" w:type="dxa"/>
-              <w:right w:w="120" w:type="dxa"/>
-            </w:tcMar>
-            <w:vAlign w:val="center"/>
-          </w:tcPr>
-          <w:p>
-            <w:pPr>
-              <w:rPr>
-                <w:sz w:val="22"/>
-                <w:szCs w:val="22"/>
-              </w:rPr>
-            </w:pPr>
-            <w:r>
-              <w:rPr>
-                <w:color w:val="132232"/>
-                <w:sz w:val="22"/>
-                <w:szCs w:val="22"/>
-              </w:rPr>
-              <w:t>{{result}}</w:t>
-            </w:r>
-          </w:p>
-        </w:tc>
-        <w:tc>
-          <w:tcPr>
-            <w:tcW w:w="5494" w:type="dxa"/>
-            <w:tcMar>
-              <w:top w:w="80" w:type="dxa"/>
-              <w:left w:w="120" w:type="dxa"/>
-              <w:bottom w:w="80" w:type="dxa"/>
-              <w:right w:w="120" w:type="dxa"/>
-            </w:tcMar>
-            <w:vAlign w:val="center"/>
-          </w:tcPr>
-          <w:p>
-            <w:pPr>
-              <w:rPr>
-                <w:sz w:val="22"/>
-                <w:szCs w:val="22"/>
-              </w:rPr>
-            </w:pPr>
-            <w:r>
-              <w:rPr>
-                <w:sz w:val="22"/>
-                <w:szCs w:val="22"/>
-              </w:rPr>
-              <w:t>{{interpretation</w:t>
-            </w:r>
-            <w:proofErr w:type="gramStart"/>
-            <w:r>
-              <w:rPr>
-                <w:sz w:val="22"/>
-                <w:szCs w:val="22"/>
-              </w:rPr>
-              <w:t>}}{</w:t>
-            </w:r>
-            <w:proofErr w:type="gramEnd"/>
-            <w:r>
-              <w:rPr>
-                <w:sz w:val="22"/>
-                <w:szCs w:val="22"/>
-              </w:rPr>
-              <w:t>{/</w:t>
-            </w:r>
-            <w:proofErr w:type="spellStart"/>
-            <w:r>
-              <w:rPr>
-                <w:sz w:val="22"/>
-                <w:szCs w:val="22"/>
-              </w:rPr>
-              <w:t>oa_rows</w:t>
-            </w:r>
-            <w:proofErr w:type="spellEnd"/>
-            <w:r>
-              <w:rPr>
-                <w:sz w:val="22"/>
-                <w:szCs w:val="22"/>
-              </w:rPr>
-              <w:t>}}</w:t>
-            </w:r>
-          </w:p>
-        </w:tc>
-      </w:tr>
-      <w:tr>
-        <w:tc>
-          <w:tcPr>
-            <w:tcW w:w="2436" w:type="dxa"/>
-            <w:tcMar>
-              <w:top w:w="80" w:type="dxa"/>
-              <w:left w:w="120" w:type="dxa"/>
-              <w:bottom w:w="80" w:type="dxa"/>
-              <w:right w:w="120" w:type="dxa"/>
-            </w:tcMar>
-            <w:vAlign w:val="center"/>
-          </w:tcPr>
-          <w:p>
-            <w:pPr>
-              <w:rPr>
-                <w:b/>
-                <w:bCs/>
-                <w:sz w:val="22"/>
-                <w:szCs w:val="22"/>
-              </w:rPr>
-            </w:pPr>
-            <w:r>
-              <w:rPr>
-                <w:b/>
-                <w:bCs/>
-                <w:color w:val="132232"/>
-                <w:sz w:val="22"/>
-                <w:szCs w:val="22"/>
-              </w:rPr>
-              <w:t>{{#oa_rows</w:t>
-            </w:r>
-            <w:proofErr w:type="gramStart"/>
-            <w:r>
-              <w:rPr>
-                <w:b/>
-                <w:bCs/>
-                <w:color w:val="132232"/>
-                <w:sz w:val="22"/>
-                <w:szCs w:val="22"/>
-              </w:rPr>
-              <w:t>}}{</w:t>
-            </w:r>
-            <w:proofErr w:type="gramEnd"/>
-            <w:r>
-              <w:rPr>
-                <w:b/>
-                <w:bCs/>
-                <w:color w:val="132232"/>
-                <w:sz w:val="22"/>
-                <w:szCs w:val="22"/>
-              </w:rPr>
-              <w:t xml:space="preserve">{test}}  </w:t>
-            </w:r>
-          </w:p>
-        </w:tc>
-        <w:tc>
-          <w:tcPr>
-            <w:tcW w:w="1816" w:type="dxa"/>
-            <w:tcMar>
-              <w:top w:w="80" w:type="dxa"/>
-              <w:left w:w="120" w:type="dxa"/>
-              <w:bottom w:w="80" w:type="dxa"/>
-              <w:right w:w="120" w:type="dxa"/>
-            </w:tcMar>
-            <w:vAlign w:val="center"/>
-          </w:tcPr>
-          <w:p>
-            <w:pPr>
-              <w:rPr>
-                <w:sz w:val="22"/>
-                <w:szCs w:val="22"/>
-              </w:rPr>
-            </w:pPr>
-            <w:r>
-              <w:rPr>
-                <w:color w:val="132232"/>
-                <w:sz w:val="22"/>
-                <w:szCs w:val="22"/>
-              </w:rPr>
-              <w:t>{{result}}</w:t>
-            </w:r>
-          </w:p>
-        </w:tc>
-        <w:tc>
-          <w:tcPr>
-            <w:tcW w:w="5494" w:type="dxa"/>
-            <w:tcMar>
-              <w:top w:w="80" w:type="dxa"/>
-              <w:left w:w="120" w:type="dxa"/>
-              <w:bottom w:w="80" w:type="dxa"/>
-              <w:right w:w="120" w:type="dxa"/>
-            </w:tcMar>
-            <w:vAlign w:val="center"/>
-          </w:tcPr>
-          <w:p>
-            <w:pPr>
-              <w:rPr>
-                <w:sz w:val="22"/>
-                <w:szCs w:val="22"/>
-              </w:rPr>
-            </w:pPr>
-            <w:r>
-              <w:rPr>
-                <w:sz w:val="22"/>
-                <w:szCs w:val="22"/>
-              </w:rPr>
-              <w:t>{{interpretation</w:t>
-            </w:r>
-            <w:proofErr w:type="gramStart"/>
-            <w:r>
-              <w:rPr>
-                <w:sz w:val="22"/>
-                <w:szCs w:val="22"/>
-              </w:rPr>
-              <w:t>}}{</w:t>
-            </w:r>
-            <w:proofErr w:type="gramEnd"/>
-            <w:r>
-              <w:rPr>
-                <w:sz w:val="22"/>
-                <w:szCs w:val="22"/>
-              </w:rPr>
-              <w:t>{/</w:t>
-            </w:r>
-            <w:proofErr w:type="spellStart"/>
-            <w:r>
-              <w:rPr>
-                <w:sz w:val="22"/>
-                <w:szCs w:val="22"/>
-              </w:rPr>
-              <w:t>oa_rows</w:t>
-            </w:r>
-            <w:proofErr w:type="spellEnd"/>
-            <w:r>
-              <w:rPr>
-                <w:sz w:val="22"/>
-                <w:szCs w:val="22"/>
-              </w:rPr>
-              <w:t>}}</w:t>
+              <w:t>{{interpretation}}{{/oa_rows}}</w:t>
             </w:r>
           </w:p>
         </w:tc>
@@ -2590,59 +1250,13 @@
           <w:szCs w:val="22"/>
         </w:rPr>
       </w:pPr>
-      <w:proofErr w:type="gramStart"/>
-      <w:r>
-        <w:rPr>
-          <w:color w:val="132232"/>
-          <w:sz w:val="22"/>
-          <w:szCs w:val="22"/>
-        </w:rPr>
-        <w:t xml:space="preserve">{{ </w:t>
-      </w:r>
-      <w:proofErr w:type="spellStart"/>
-      <w:r>
-        <w:rPr>
-          <w:color w:val="132232"/>
-          <w:sz w:val="22"/>
-          <w:szCs w:val="22"/>
-        </w:rPr>
-        <w:t>goals</w:t>
-      </w:r>
-      <w:proofErr w:type="gramEnd"/>
-      <w:r>
-        <w:rPr>
-          <w:color w:val="132232"/>
-          <w:sz w:val="22"/>
-          <w:szCs w:val="22"/>
-        </w:rPr>
-        <w:t>_</w:t>
-      </w:r>
-      <w:proofErr w:type="gramStart"/>
-      <w:r>
-        <w:rPr>
-          <w:color w:val="132232"/>
-          <w:sz w:val="22"/>
-          <w:szCs w:val="22"/>
-        </w:rPr>
-        <w:t>intro</w:t>
-      </w:r>
-      <w:proofErr w:type="spellEnd"/>
-      <w:r>
-        <w:rPr>
-          <w:color w:val="132232"/>
-          <w:sz w:val="22"/>
-          <w:szCs w:val="22"/>
-        </w:rPr>
-        <w:t xml:space="preserve"> }</w:t>
-      </w:r>
-      <w:proofErr w:type="gramEnd"/>
-      <w:r>
-        <w:rPr>
-          <w:color w:val="132232"/>
-          <w:sz w:val="22"/>
-          <w:szCs w:val="22"/>
-        </w:rPr>
-        <w:t>}</w:t>
+      <w:r>
+        <w:rPr>
+          <w:color w:val="132232"/>
+          <w:sz w:val="22"/>
+          <w:szCs w:val="22"/>
+        </w:rPr>
+        <w:t>{{ goals_intro }}</w:t>
       </w:r>
     </w:p>
     <w:p>
@@ -2666,41 +1280,13 @@
           <w:szCs w:val="22"/>
         </w:rPr>
       </w:pPr>
-      <w:proofErr w:type="gramStart"/>
-      <w:r>
-        <w:rPr>
-          <w:color w:val="132232"/>
-          <w:sz w:val="22"/>
-          <w:szCs w:val="22"/>
-        </w:rPr>
-        <w:t>{{ goal</w:t>
-      </w:r>
-      <w:proofErr w:type="gramEnd"/>
-      <w:r>
-        <w:rPr>
-          <w:color w:val="132232"/>
-          <w:sz w:val="22"/>
-          <w:szCs w:val="22"/>
-        </w:rPr>
-        <w:t>_</w:t>
-      </w:r>
-      <w:proofErr w:type="gramStart"/>
-      <w:r>
-        <w:rPr>
-          <w:color w:val="132232"/>
-          <w:sz w:val="22"/>
-          <w:szCs w:val="22"/>
-        </w:rPr>
-        <w:t>1 }</w:t>
-      </w:r>
-      <w:proofErr w:type="gramEnd"/>
-      <w:r>
-        <w:rPr>
-          <w:color w:val="132232"/>
-          <w:sz w:val="22"/>
-          <w:szCs w:val="22"/>
-        </w:rPr>
-        <w:t>}</w:t>
+      <w:r>
+        <w:rPr>
+          <w:color w:val="132232"/>
+          <w:sz w:val="22"/>
+          <w:szCs w:val="22"/>
+        </w:rPr>
+        <w:t>{{ goal_1 }}</w:t>
       </w:r>
     </w:p>
     <w:p>
@@ -2724,41 +1310,13 @@
           <w:szCs w:val="22"/>
         </w:rPr>
       </w:pPr>
-      <w:proofErr w:type="gramStart"/>
-      <w:r>
-        <w:rPr>
-          <w:color w:val="132232"/>
-          <w:sz w:val="22"/>
-          <w:szCs w:val="22"/>
-        </w:rPr>
-        <w:t>{{ goal</w:t>
-      </w:r>
-      <w:proofErr w:type="gramEnd"/>
-      <w:r>
-        <w:rPr>
-          <w:color w:val="132232"/>
-          <w:sz w:val="22"/>
-          <w:szCs w:val="22"/>
-        </w:rPr>
-        <w:t>_</w:t>
-      </w:r>
-      <w:proofErr w:type="gramStart"/>
-      <w:r>
-        <w:rPr>
-          <w:color w:val="132232"/>
-          <w:sz w:val="22"/>
-          <w:szCs w:val="22"/>
-        </w:rPr>
-        <w:t>2 }</w:t>
-      </w:r>
-      <w:proofErr w:type="gramEnd"/>
-      <w:r>
-        <w:rPr>
-          <w:color w:val="132232"/>
-          <w:sz w:val="22"/>
-          <w:szCs w:val="22"/>
-        </w:rPr>
-        <w:t>}</w:t>
+      <w:r>
+        <w:rPr>
+          <w:color w:val="132232"/>
+          <w:sz w:val="22"/>
+          <w:szCs w:val="22"/>
+        </w:rPr>
+        <w:t>{{ goal_2 }}</w:t>
       </w:r>
     </w:p>
     <w:p>
@@ -2782,41 +1340,13 @@
           <w:szCs w:val="22"/>
         </w:rPr>
       </w:pPr>
-      <w:proofErr w:type="gramStart"/>
-      <w:r>
-        <w:rPr>
-          <w:color w:val="132232"/>
-          <w:sz w:val="22"/>
-          <w:szCs w:val="22"/>
-        </w:rPr>
-        <w:t>{{ goal</w:t>
-      </w:r>
-      <w:proofErr w:type="gramEnd"/>
-      <w:r>
-        <w:rPr>
-          <w:color w:val="132232"/>
-          <w:sz w:val="22"/>
-          <w:szCs w:val="22"/>
-        </w:rPr>
-        <w:t>_</w:t>
-      </w:r>
-      <w:proofErr w:type="gramStart"/>
-      <w:r>
-        <w:rPr>
-          <w:color w:val="132232"/>
-          <w:sz w:val="22"/>
-          <w:szCs w:val="22"/>
-        </w:rPr>
-        <w:t>3 }</w:t>
-      </w:r>
-      <w:proofErr w:type="gramEnd"/>
-      <w:r>
-        <w:rPr>
-          <w:color w:val="132232"/>
-          <w:sz w:val="22"/>
-          <w:szCs w:val="22"/>
-        </w:rPr>
-        <w:t>}</w:t>
+      <w:r>
+        <w:rPr>
+          <w:color w:val="132232"/>
+          <w:sz w:val="22"/>
+          <w:szCs w:val="22"/>
+        </w:rPr>
+        <w:t>{{ goal_3 }}</w:t>
       </w:r>
     </w:p>
     <w:p>
@@ -2859,60 +1389,13 @@
           <w:szCs w:val="22"/>
         </w:rPr>
       </w:pPr>
-      <w:proofErr w:type="gramStart"/>
-      <w:r>
-        <w:rPr>
-          <w:color w:val="132232"/>
-          <w:sz w:val="22"/>
-          <w:szCs w:val="22"/>
-        </w:rPr>
-        <w:lastRenderedPageBreak/>
-        <w:t xml:space="preserve">{{ </w:t>
-      </w:r>
-      <w:proofErr w:type="spellStart"/>
-      <w:r>
-        <w:rPr>
-          <w:color w:val="132232"/>
-          <w:sz w:val="22"/>
-          <w:szCs w:val="22"/>
-        </w:rPr>
-        <w:t>management</w:t>
-      </w:r>
-      <w:proofErr w:type="gramEnd"/>
-      <w:r>
-        <w:rPr>
-          <w:color w:val="132232"/>
-          <w:sz w:val="22"/>
-          <w:szCs w:val="22"/>
-        </w:rPr>
-        <w:t>_</w:t>
-      </w:r>
-      <w:proofErr w:type="gramStart"/>
-      <w:r>
-        <w:rPr>
-          <w:color w:val="132232"/>
-          <w:sz w:val="22"/>
-          <w:szCs w:val="22"/>
-        </w:rPr>
-        <w:t>plan</w:t>
-      </w:r>
-      <w:proofErr w:type="spellEnd"/>
-      <w:r>
-        <w:rPr>
-          <w:color w:val="132232"/>
-          <w:sz w:val="22"/>
-          <w:szCs w:val="22"/>
-        </w:rPr>
-        <w:t xml:space="preserve"> }</w:t>
-      </w:r>
-      <w:proofErr w:type="gramEnd"/>
-      <w:r>
-        <w:rPr>
-          <w:color w:val="132232"/>
-          <w:sz w:val="22"/>
-          <w:szCs w:val="22"/>
-        </w:rPr>
-        <w:t>}</w:t>
+      <w:r>
+        <w:rPr>
+          <w:color w:val="132232"/>
+          <w:sz w:val="22"/>
+          <w:szCs w:val="22"/>
+        </w:rPr>
+        <w:t>{{ management_plan }}</w:t>
       </w:r>
     </w:p>
     <w:sectPr>
@@ -2960,55 +1443,13 @@
     <w:pPr>
       <w:jc w:val="center"/>
     </w:pPr>
-    <w:proofErr w:type="spellStart"/>
     <w:r>
       <w:rPr>
         <w:sz w:val="16"/>
         <w:szCs w:val="16"/>
       </w:rPr>
-      <w:t>Moveify</w:t>
+      <w:t xml:space="preserve">Moveify Health Solutions  ·  Exercise Physiology  |    </w:t>
     </w:r>
-    <w:proofErr w:type="spellEnd"/>
-    <w:r>
-      <w:rPr>
-        <w:sz w:val="16"/>
-        <w:szCs w:val="16"/>
-      </w:rPr>
-      <w:t xml:space="preserve"> Health </w:t>
-    </w:r>
-    <w:proofErr w:type="gramStart"/>
-    <w:r>
-      <w:rPr>
-        <w:sz w:val="16"/>
-        <w:szCs w:val="16"/>
-      </w:rPr>
-      <w:t>Solutions  ·</w:t>
-    </w:r>
-    <w:proofErr w:type="gramEnd"/>
-    <w:r>
-      <w:rPr>
-        <w:sz w:val="16"/>
-        <w:szCs w:val="16"/>
-      </w:rPr>
-      <w:t xml:space="preserve">  Exercise </w:t>
-    </w:r>
-    <w:proofErr w:type="gramStart"/>
-    <w:r>
-      <w:rPr>
-        <w:sz w:val="16"/>
-        <w:szCs w:val="16"/>
-      </w:rPr>
-      <w:t>Physiology  |</w:t>
-    </w:r>
-    <w:proofErr w:type="gramEnd"/>
-    <w:r>
-      <w:rPr>
-        <w:sz w:val="16"/>
-        <w:szCs w:val="16"/>
-      </w:rPr>
-      <w:t xml:space="preserve">    </w:t>
-    </w:r>
-    <w:proofErr w:type="gramStart"/>
     <w:r>
       <w:rPr>
         <w:sz w:val="16"/>
@@ -3021,15 +1462,7 @@
         <w:sz w:val="16"/>
         <w:szCs w:val="16"/>
       </w:rPr>
-      <w:t xml:space="preserve">  ·</w:t>
-    </w:r>
-    <w:proofErr w:type="gramEnd"/>
-    <w:r>
-      <w:rPr>
-        <w:sz w:val="16"/>
-        <w:szCs w:val="16"/>
-      </w:rPr>
-      <w:t xml:space="preserve"> </w:t>
+      <w:t xml:space="preserve">  · </w:t>
     </w:r>
     <w:r>
       <w:rPr>
@@ -3043,23 +1476,7 @@
         <w:sz w:val="16"/>
         <w:szCs w:val="16"/>
       </w:rPr>
-      <w:t xml:space="preserve"> </w:t>
-    </w:r>
-    <w:proofErr w:type="gramStart"/>
-    <w:r>
-      <w:rPr>
-        <w:sz w:val="16"/>
-        <w:szCs w:val="16"/>
-      </w:rPr>
-      <w:t>·  ABN</w:t>
-    </w:r>
-    <w:proofErr w:type="gramEnd"/>
-    <w:r>
-      <w:rPr>
-        <w:sz w:val="16"/>
-        <w:szCs w:val="16"/>
-      </w:rPr>
-      <w:t xml:space="preserve">: </w:t>
+      <w:t xml:space="preserve"> ·  ABN: </w:t>
     </w:r>
     <w:r>
       <w:rPr>

</xml_diff>